<commit_message>
docs: sync cleaned data query into BaoCao Word and generator
</commit_message>
<xml_diff>
--- a/docs/BaoCao_QuanTriCSDL_NetCafe.docx
+++ b/docs/BaoCao_QuanTriCSDL_NetCafe.docx
@@ -1314,7 +1314,7 @@
         <w:pStyle w:val="Heading2"/>
       </w:pPr>
       <w:r>
-        <w:t>1.1. Danh mục 10 chức năng nghiệp vụ cốt lõi</w:t>
+        <w:t>1.1. Danh mục 9 chức năng nghiệp vụ cốt lõi</w:t>
       </w:r>
     </w:p>
     <w:tbl>
@@ -1538,7 +1538,7 @@
                 <w:color w:val="2C3E50"/>
                 <w:sz w:val="18"/>
               </w:rPr>
-              <w:t>4. Đặt máy trước (Booking)</w:t>
+              <w:t>4. Dịch vụ F&amp;B &amp; Kho</w:t>
             </w:r>
           </w:p>
         </w:tc>
@@ -1560,7 +1560,7 @@
                 <w:color w:val="2C3E50"/>
                 <w:sz w:val="18"/>
               </w:rPr>
-              <w:t>Khách, máy, khung giờ đặt (booked_from đến booked_to), chống đặt trùng thời gian bằng thuật toán khóa phạm vi EXCLUDE gist.</w:t>
+              <w:t>Danh mục món, sản phẩm đồ ăn/uống, quản lý đơn gọi món theo phiên chơi, trừ tồn kho tự động qua Trigger.</w:t>
             </w:r>
           </w:p>
         </w:tc>
@@ -1584,7 +1584,7 @@
                 <w:color w:val="2C3E50"/>
                 <w:sz w:val="18"/>
               </w:rPr>
-              <w:t>5. Dịch vụ F&amp;B &amp; Kho</w:t>
+              <w:t>5. Hóa đơn &amp; Thanh toán</w:t>
             </w:r>
           </w:p>
         </w:tc>
@@ -1606,7 +1606,7 @@
                 <w:color w:val="2C3E50"/>
                 <w:sz w:val="18"/>
               </w:rPr>
-              <w:t>Danh mục món, sản phẩm đồ ăn/uống, quản lý đơn gọi món theo phiên chơi, trừ tồn kho tự động qua Trigger.</w:t>
+              <w:t>Tổng kết phiên chơi: Tiền giờ + Dịch vụ F&amp;B + Phụ phí - Giảm giá = Tổng tiền. Thanh toán qua ví hội viên hoặc tiền mặt/chuyển khoản.</w:t>
             </w:r>
           </w:p>
         </w:tc>
@@ -1630,7 +1630,7 @@
                 <w:color w:val="2C3E50"/>
                 <w:sz w:val="18"/>
               </w:rPr>
-              <w:t>6. Hóa đơn &amp; Thanh toán</w:t>
+              <w:t>6. Quản trị nhân sự</w:t>
             </w:r>
           </w:p>
         </w:tc>
@@ -1652,7 +1652,7 @@
                 <w:color w:val="2C3E50"/>
                 <w:sz w:val="18"/>
               </w:rPr>
-              <w:t>Tổng kết phiên chơi: Tiền giờ + Dịch vụ F&amp;B + Phụ phí - Giảm giá = Tổng tiền. Thanh toán qua ví hội viên hoặc tiền mặt/chuyển khoản.</w:t>
+              <w:t>Phân quyền 3 vai trò (Admin, Manager, Cashier), ca làm việc, bảo vệ mức lương tuyệt đối.</w:t>
             </w:r>
           </w:p>
         </w:tc>
@@ -1676,7 +1676,7 @@
                 <w:color w:val="2C3E50"/>
                 <w:sz w:val="18"/>
               </w:rPr>
-              <w:t>7. Quản trị nhân sự</w:t>
+              <w:t>7. Bảo trì phòng máy</w:t>
             </w:r>
           </w:p>
         </w:tc>
@@ -1698,7 +1698,7 @@
                 <w:color w:val="2C3E50"/>
                 <w:sz w:val="18"/>
               </w:rPr>
-              <w:t>Phân quyền 5 vai trò (Admin, Manager, Cashier, Staff, Technician), ca làm việc, bảo vệ mức lương tuyệt đối.</w:t>
+              <w:t>Ghi nhận máy lỗi, kỹ thuật viên phụ trách, chi phí, linh kiện thay thế lưu dạng JSONB linh hoạt.</w:t>
             </w:r>
           </w:p>
         </w:tc>
@@ -1722,7 +1722,7 @@
                 <w:color w:val="2C3E50"/>
                 <w:sz w:val="18"/>
               </w:rPr>
-              <w:t>8. Bảo trì phòng máy</w:t>
+              <w:t>8. Khuyến mãi &amp; Ưu đãi</w:t>
             </w:r>
           </w:p>
         </w:tc>
@@ -1744,7 +1744,7 @@
                 <w:color w:val="2C3E50"/>
                 <w:sz w:val="18"/>
               </w:rPr>
-              <w:t>Ghi nhận máy lỗi, kỹ thuật viên phụ trách, chi phí, linh kiện thay thế lưu dạng JSONB linh hoạt.</w:t>
+              <w:t>Mã giảm giá, Happy Hour khung giờ đêm, ưu đãi theo hạng thành viên Gold/VIP, lưu điều kiện áp dụng JSONB.</w:t>
             </w:r>
           </w:p>
         </w:tc>
@@ -1768,7 +1768,7 @@
                 <w:color w:val="2C3E50"/>
                 <w:sz w:val="18"/>
               </w:rPr>
-              <w:t>9. Khuyến mãi &amp; Ưu đãi</w:t>
+              <w:t>9. Báo cáo &amp; Thống kê</w:t>
             </w:r>
           </w:p>
         </w:tc>
@@ -1783,52 +1783,6 @@
               <w:right w:w="120" w:type="dxa"/>
             </w:tcMar>
             <w:shd w:val="clear" w:color="auto" w:fill="FFFFFF"/>
-          </w:tcPr>
-          <w:p>
-            <w:r>
-              <w:rPr>
-                <w:color w:val="2C3E50"/>
-                <w:sz w:val="18"/>
-              </w:rPr>
-              <w:t>Mã giảm giá, Happy Hour khung giờ đêm, ưu đãi theo hạng thành viên Gold/VIP, lưu điều kiện áp dụng JSONB.</w:t>
-            </w:r>
-          </w:p>
-        </w:tc>
-      </w:tr>
-      <w:tr>
-        <w:tc>
-          <w:tcPr>
-            <w:tcW w:type="dxa" w:w="4680"/>
-            <w:vAlign w:val="center"/>
-            <w:tcMar>
-              <w:top w:w="80" w:type="dxa"/>
-              <w:bottom w:w="80" w:type="dxa"/>
-              <w:left w:w="120" w:type="dxa"/>
-              <w:right w:w="120" w:type="dxa"/>
-            </w:tcMar>
-            <w:shd w:val="clear" w:color="auto" w:fill="F2F4F4"/>
-          </w:tcPr>
-          <w:p>
-            <w:r>
-              <w:rPr>
-                <w:color w:val="2C3E50"/>
-                <w:sz w:val="18"/>
-              </w:rPr>
-              <w:t>10. Báo cáo &amp; Thống kê</w:t>
-            </w:r>
-          </w:p>
-        </w:tc>
-        <w:tc>
-          <w:tcPr>
-            <w:tcW w:type="dxa" w:w="4680"/>
-            <w:vAlign w:val="center"/>
-            <w:tcMar>
-              <w:top w:w="80" w:type="dxa"/>
-              <w:bottom w:w="80" w:type="dxa"/>
-              <w:left w:w="120" w:type="dxa"/>
-              <w:right w:w="120" w:type="dxa"/>
-            </w:tcMar>
-            <w:shd w:val="clear" w:color="auto" w:fill="F2F4F4"/>
           </w:tcPr>
           <w:p>
             <w:r>
@@ -1963,7 +1917,7 @@
                 <w:color w:val="2C3E50"/>
                 <w:sz w:val="18"/>
               </w:rPr>
-              <w:t>Chứa các thực thể nền tảng: room, computer_type, computer, customer, gaming_session, booking.</w:t>
+              <w:t>Chứa các thực thể nền tảng: room, computer_type, computer, customer, gaming_session và yêu cầu hỗ trợ.</w:t>
             </w:r>
           </w:p>
         </w:tc>
@@ -2480,7 +2434,7 @@
         <w:pStyle w:val="Heading2"/>
       </w:pPr>
       <w:r>
-        <w:t>2.2. Ma trận Ràng buộc Toàn vẹn (17 Test Cases PASS)</w:t>
+        <w:t>2.2. Ma trận Ràng buộc Toàn vẹn (16 Test Cases PASS)</w:t>
       </w:r>
     </w:p>
     <w:p>
@@ -2488,7 +2442,7 @@
         <w:spacing w:line="276" w:lineRule="auto"/>
       </w:pPr>
       <w:r>
-        <w:t>Hệ thống đã trải qua bộ kiểm thử tự động gồm 17 bài test ràng buộc toàn vẹn nghiêm ngặt trong file tests/verify.sql. Kết quả chạy thực tế trên máy chủ PostgreSQL 17 đạt tỷ lệ chính xác 17/17 (100% PASS - Ghi nhận tại evidence/test_verify.log):</w:t>
+        <w:t>Hệ thống đã trải qua bộ kiểm thử tự động gồm 16 bài test ràng buộc toàn vẹn nghiêm ngặt trong file tests/verify.sql. Kết quả chạy thực tế trên máy chủ PostgreSQL 17 đạt tỷ lệ chính xác 16/16 (100% PASS - Ghi nhận tại evidence/test_verify.log):</w:t>
       </w:r>
     </w:p>
     <w:tbl>
@@ -2655,7 +2609,7 @@
                 <w:color w:val="2C3E50"/>
                 <w:sz w:val="18"/>
               </w:rPr>
-              <w:t>C1: ex_booking_no_overlap</w:t>
+              <w:t>C1: ck_invoice_total_amount</w:t>
             </w:r>
           </w:p>
         </w:tc>
@@ -2677,7 +2631,7 @@
                 <w:color w:val="2C3E50"/>
                 <w:sz w:val="18"/>
               </w:rPr>
-              <w:t>core.booking</w:t>
+              <w:t>billing.invoice</w:t>
             </w:r>
           </w:p>
         </w:tc>
@@ -2699,7 +2653,7 @@
                 <w:color w:val="2C3E50"/>
                 <w:sz w:val="18"/>
               </w:rPr>
-              <w:t>EXCLUDE USING gist (computer_id WITH =, tstzrange(from,to) WITH &amp;&amp;)</w:t>
+              <w:t>CHECK (total_amount &gt;= 0)</w:t>
             </w:r>
           </w:p>
         </w:tc>
@@ -2743,7 +2697,7 @@
                 <w:color w:val="2C3E50"/>
                 <w:sz w:val="18"/>
               </w:rPr>
-              <w:t>Chặn 100% đặt trùng giờ máy tính</w:t>
+              <w:t>Chặn số tiền hóa đơn âm</w:t>
             </w:r>
           </w:p>
         </w:tc>
@@ -2767,7 +2721,7 @@
                 <w:color w:val="2C3E50"/>
                 <w:sz w:val="18"/>
               </w:rPr>
-              <w:t>C2: ck_invoice_total_amount</w:t>
+              <w:t>C2: ck_invoice_formula</w:t>
             </w:r>
           </w:p>
         </w:tc>
@@ -2811,7 +2765,7 @@
                 <w:color w:val="2C3E50"/>
                 <w:sz w:val="18"/>
               </w:rPr>
-              <w:t>CHECK (total_amount &gt;= 0)</w:t>
+              <w:t>CHECK (total = play + service + surcharge - discount)</w:t>
             </w:r>
           </w:p>
         </w:tc>
@@ -2855,7 +2809,7 @@
                 <w:color w:val="2C3E50"/>
                 <w:sz w:val="18"/>
               </w:rPr>
-              <w:t>Chặn số tiền hóa đơn âm</w:t>
+              <w:t>Bảo đảm công thức toán học bất biến</w:t>
             </w:r>
           </w:p>
         </w:tc>
@@ -2879,7 +2833,7 @@
                 <w:color w:val="2C3E50"/>
                 <w:sz w:val="18"/>
               </w:rPr>
-              <w:t>C3: ck_invoice_formula</w:t>
+              <w:t>C3: ck_session_time_order</w:t>
             </w:r>
           </w:p>
         </w:tc>
@@ -2901,7 +2855,7 @@
                 <w:color w:val="2C3E50"/>
                 <w:sz w:val="18"/>
               </w:rPr>
-              <w:t>billing.invoice</w:t>
+              <w:t>core.gaming_session</w:t>
             </w:r>
           </w:p>
         </w:tc>
@@ -2923,7 +2877,7 @@
                 <w:color w:val="2C3E50"/>
                 <w:sz w:val="18"/>
               </w:rPr>
-              <w:t>CHECK (total = play + service + surcharge - discount)</w:t>
+              <w:t>CHECK (end_time IS NULL OR end_time &gt; start_time)</w:t>
             </w:r>
           </w:p>
         </w:tc>
@@ -2967,7 +2921,7 @@
                 <w:color w:val="2C3E50"/>
                 <w:sz w:val="18"/>
               </w:rPr>
-              <w:t>Bảo đảm công thức toán học bất biến</w:t>
+              <w:t>Chặn giờ kết thúc trước giờ bắt đầu</w:t>
             </w:r>
           </w:p>
         </w:tc>
@@ -2991,7 +2945,7 @@
                 <w:color w:val="2C3E50"/>
                 <w:sz w:val="18"/>
               </w:rPr>
-              <w:t>C4: ck_session_time_order</w:t>
+              <w:t>C4: ck_session_status_time</w:t>
             </w:r>
           </w:p>
         </w:tc>
@@ -3035,7 +2989,7 @@
                 <w:color w:val="2C3E50"/>
                 <w:sz w:val="18"/>
               </w:rPr>
-              <w:t>CHECK (end_time IS NULL OR end_time &gt; start_time)</w:t>
+              <w:t>CHECK ((status='active') = (end_time IS NULL))</w:t>
             </w:r>
           </w:p>
         </w:tc>
@@ -3079,7 +3033,7 @@
                 <w:color w:val="2C3E50"/>
                 <w:sz w:val="18"/>
               </w:rPr>
-              <w:t>Chặn giờ kết thúc trước giờ bắt đầu</w:t>
+              <w:t>Đồng bộ tuyệt đối trạng thái và thời gian</w:t>
             </w:r>
           </w:p>
         </w:tc>
@@ -3103,7 +3057,7 @@
                 <w:color w:val="2C3E50"/>
                 <w:sz w:val="18"/>
               </w:rPr>
-              <w:t>C5: ck_session_status_time</w:t>
+              <w:t>C5: ck_customer_balance</w:t>
             </w:r>
           </w:p>
         </w:tc>
@@ -3125,7 +3079,7 @@
                 <w:color w:val="2C3E50"/>
                 <w:sz w:val="18"/>
               </w:rPr>
-              <w:t>core.gaming_session</w:t>
+              <w:t>core.customer</w:t>
             </w:r>
           </w:p>
         </w:tc>
@@ -3147,7 +3101,7 @@
                 <w:color w:val="2C3E50"/>
                 <w:sz w:val="18"/>
               </w:rPr>
-              <w:t>CHECK ((status='active') = (end_time IS NULL))</w:t>
+              <w:t>CHECK (balance &gt;= 0)</w:t>
             </w:r>
           </w:p>
         </w:tc>
@@ -3191,7 +3145,7 @@
                 <w:color w:val="2C3E50"/>
                 <w:sz w:val="18"/>
               </w:rPr>
-              <w:t>Đồng bộ tuyệt đối trạng thái và thời gian</w:t>
+              <w:t>Ngăn chặn số dư tài khoản âm</w:t>
             </w:r>
           </w:p>
         </w:tc>
@@ -3215,7 +3169,7 @@
                 <w:color w:val="2C3E50"/>
                 <w:sz w:val="18"/>
               </w:rPr>
-              <w:t>C6: ck_customer_balance</w:t>
+              <w:t>C6: ck_customer_phone_format</w:t>
             </w:r>
           </w:p>
         </w:tc>
@@ -3259,7 +3213,7 @@
                 <w:color w:val="2C3E50"/>
                 <w:sz w:val="18"/>
               </w:rPr>
-              <w:t>CHECK (balance &gt;= 0)</w:t>
+              <w:t>CHECK (phone ~ '^0[35789][0-9]{8}$')</w:t>
             </w:r>
           </w:p>
         </w:tc>
@@ -3303,7 +3257,7 @@
                 <w:color w:val="2C3E50"/>
                 <w:sz w:val="18"/>
               </w:rPr>
-              <w:t>Ngăn chặn số dư tài khoản âm</w:t>
+              <w:t>Bảo đảm định dạng SĐT di động Việt Nam</w:t>
             </w:r>
           </w:p>
         </w:tc>
@@ -3327,7 +3281,7 @@
                 <w:color w:val="2C3E50"/>
                 <w:sz w:val="18"/>
               </w:rPr>
-              <w:t>C7: ck_customer_phone_format</w:t>
+              <w:t>C7: ck_payment_kind_invoice</w:t>
             </w:r>
           </w:p>
         </w:tc>
@@ -3349,7 +3303,7 @@
                 <w:color w:val="2C3E50"/>
                 <w:sz w:val="18"/>
               </w:rPr>
-              <w:t>core.customer</w:t>
+              <w:t>billing.payment</w:t>
             </w:r>
           </w:p>
         </w:tc>
@@ -3371,7 +3325,7 @@
                 <w:color w:val="2C3E50"/>
                 <w:sz w:val="18"/>
               </w:rPr>
-              <w:t>CHECK (phone ~ '^0[35789][0-9]{8}$')</w:t>
+              <w:t>CHECK ((kind='invoice' AND id IS NOT NULL) OR ...)</w:t>
             </w:r>
           </w:p>
         </w:tc>
@@ -3415,7 +3369,7 @@
                 <w:color w:val="2C3E50"/>
                 <w:sz w:val="18"/>
               </w:rPr>
-              <w:t>Bảo đảm định dạng SĐT di động Việt Nam</w:t>
+              <w:t>Khớp loại thanh toán và ID hóa đơn</w:t>
             </w:r>
           </w:p>
         </w:tc>
@@ -3439,7 +3393,7 @@
                 <w:color w:val="2C3E50"/>
                 <w:sz w:val="18"/>
               </w:rPr>
-              <w:t>C8: ck_payment_kind_invoice</w:t>
+              <w:t>C8: uq_computer_ip</w:t>
             </w:r>
           </w:p>
         </w:tc>
@@ -3461,7 +3415,7 @@
                 <w:color w:val="2C3E50"/>
                 <w:sz w:val="18"/>
               </w:rPr>
-              <w:t>billing.payment</w:t>
+              <w:t>core.computer</w:t>
             </w:r>
           </w:p>
         </w:tc>
@@ -3483,7 +3437,7 @@
                 <w:color w:val="2C3E50"/>
                 <w:sz w:val="18"/>
               </w:rPr>
-              <w:t>CHECK ((kind='invoice' AND id IS NOT NULL) OR ...)</w:t>
+              <w:t>UNIQUE (ip_address)</w:t>
             </w:r>
           </w:p>
         </w:tc>
@@ -3527,7 +3481,7 @@
                 <w:color w:val="2C3E50"/>
                 <w:sz w:val="18"/>
               </w:rPr>
-              <w:t>Khớp loại thanh toán và ID hóa đơn</w:t>
+              <w:t>Chặn trùng lặp IP trong mạng LAN</w:t>
             </w:r>
           </w:p>
         </w:tc>
@@ -3551,7 +3505,7 @@
                 <w:color w:val="2C3E50"/>
                 <w:sz w:val="18"/>
               </w:rPr>
-              <w:t>C9: uq_computer_ip</w:t>
+              <w:t>C9: uq_computer_mac</w:t>
             </w:r>
           </w:p>
         </w:tc>
@@ -3595,7 +3549,7 @@
                 <w:color w:val="2C3E50"/>
                 <w:sz w:val="18"/>
               </w:rPr>
-              <w:t>UNIQUE (ip_address)</w:t>
+              <w:t>UNIQUE (mac_address)</w:t>
             </w:r>
           </w:p>
         </w:tc>
@@ -3632,118 +3586,6 @@
               <w:right w:w="120" w:type="dxa"/>
             </w:tcMar>
             <w:shd w:val="clear" w:color="auto" w:fill="FFFFFF"/>
-          </w:tcPr>
-          <w:p>
-            <w:r>
-              <w:rPr>
-                <w:color w:val="2C3E50"/>
-                <w:sz w:val="18"/>
-              </w:rPr>
-              <w:t>Chặn trùng lặp IP trong mạng LAN</w:t>
-            </w:r>
-          </w:p>
-        </w:tc>
-      </w:tr>
-      <w:tr>
-        <w:tc>
-          <w:tcPr>
-            <w:tcW w:type="dxa" w:w="1872"/>
-            <w:vAlign w:val="center"/>
-            <w:tcMar>
-              <w:top w:w="80" w:type="dxa"/>
-              <w:bottom w:w="80" w:type="dxa"/>
-              <w:left w:w="120" w:type="dxa"/>
-              <w:right w:w="120" w:type="dxa"/>
-            </w:tcMar>
-            <w:shd w:val="clear" w:color="auto" w:fill="F2F4F4"/>
-          </w:tcPr>
-          <w:p>
-            <w:r>
-              <w:rPr>
-                <w:color w:val="2C3E50"/>
-                <w:sz w:val="18"/>
-              </w:rPr>
-              <w:t>C10: uq_computer_mac</w:t>
-            </w:r>
-          </w:p>
-        </w:tc>
-        <w:tc>
-          <w:tcPr>
-            <w:tcW w:type="dxa" w:w="1872"/>
-            <w:vAlign w:val="center"/>
-            <w:tcMar>
-              <w:top w:w="80" w:type="dxa"/>
-              <w:bottom w:w="80" w:type="dxa"/>
-              <w:left w:w="120" w:type="dxa"/>
-              <w:right w:w="120" w:type="dxa"/>
-            </w:tcMar>
-            <w:shd w:val="clear" w:color="auto" w:fill="F2F4F4"/>
-          </w:tcPr>
-          <w:p>
-            <w:r>
-              <w:rPr>
-                <w:color w:val="2C3E50"/>
-                <w:sz w:val="18"/>
-              </w:rPr>
-              <w:t>core.computer</w:t>
-            </w:r>
-          </w:p>
-        </w:tc>
-        <w:tc>
-          <w:tcPr>
-            <w:tcW w:type="dxa" w:w="1872"/>
-            <w:vAlign w:val="center"/>
-            <w:tcMar>
-              <w:top w:w="80" w:type="dxa"/>
-              <w:bottom w:w="80" w:type="dxa"/>
-              <w:left w:w="120" w:type="dxa"/>
-              <w:right w:w="120" w:type="dxa"/>
-            </w:tcMar>
-            <w:shd w:val="clear" w:color="auto" w:fill="F2F4F4"/>
-          </w:tcPr>
-          <w:p>
-            <w:r>
-              <w:rPr>
-                <w:color w:val="2C3E50"/>
-                <w:sz w:val="18"/>
-              </w:rPr>
-              <w:t>UNIQUE (mac_address)</w:t>
-            </w:r>
-          </w:p>
-        </w:tc>
-        <w:tc>
-          <w:tcPr>
-            <w:tcW w:type="dxa" w:w="1872"/>
-            <w:vAlign w:val="center"/>
-            <w:tcMar>
-              <w:top w:w="80" w:type="dxa"/>
-              <w:bottom w:w="80" w:type="dxa"/>
-              <w:left w:w="120" w:type="dxa"/>
-              <w:right w:w="120" w:type="dxa"/>
-            </w:tcMar>
-            <w:shd w:val="clear" w:color="auto" w:fill="F2F4F4"/>
-          </w:tcPr>
-          <w:p>
-            <w:r>
-              <w:rPr>
-                <w:color w:val="2C3E50"/>
-                <w:sz w:val="18"/>
-              </w:rPr>
-              <w:t>PASS</w:t>
-            </w:r>
-          </w:p>
-        </w:tc>
-        <w:tc>
-          <w:tcPr>
-            <w:tcW w:type="dxa" w:w="1872"/>
-            <w:vAlign w:val="center"/>
-            <w:tcMar>
-              <w:top w:w="80" w:type="dxa"/>
-              <w:bottom w:w="80" w:type="dxa"/>
-              <w:left w:w="120" w:type="dxa"/>
-              <w:right w:w="120" w:type="dxa"/>
-            </w:tcMar>
-            <w:shd w:val="clear" w:color="auto" w:fill="F2F4F4"/>
           </w:tcPr>
           <w:p>
             <w:r>
@@ -3790,7 +3632,7 @@
                 <w:color w:val="1B365D"/>
                 <w:sz w:val="21"/>
               </w:rPr>
-              <w:t xml:space="preserve">📌 Giải thích DBA về EXCLUDE USING GIST: </w:t>
+              <w:t xml:space="preserve">📌 Giải thích DBA về CHECK và khóa ngoại: </w:t>
             </w:r>
             <w:r>
               <w:rPr>
@@ -3798,7 +3640,7 @@
                 <w:color w:val="2C3E50"/>
                 <w:sz w:val="20"/>
               </w:rPr>
-              <w:t>Ràng buộc EXCLUDE USING gist (cần extension btree_gist) sử dụng toán tử phạm vi tstzrange và phép toán giao cắt '&amp;&amp;'. Cơ chế này khóa phạm vi trực tiếp trên chỉ mục cây GiST ở tầng nhân PostgreSQL, triệt tiêu hoàn toàn race condition khi hai khách hàng bấm đặt cùng một máy tại cùng một mili-giây, điều mà UNIQUE thông thường không làm được.</w:t>
+              <w:t>Các quy tắc tiền, thời lượng phiên, số dư và liên kết nghiệp vụ được kiểm tra ngay trong PostgreSQL. Mọi client dùng chung contract nên không thể ghi dữ liệu lệch quy tắc chỉ vì bỏ qua giao diện.</w:t>
             </w:r>
           </w:p>
         </w:tc>
@@ -4477,6 +4319,80 @@
         <w:t>4. Tiêu chí ĐỦ: Toàn bộ các trường bắt buộc của phiên chơi và hóa đơn đều được điền đầy đủ, không bị rỗng NULL trái phép.</w:t>
       </w:r>
     </w:p>
+    <w:tbl>
+      <w:tblPr>
+        <w:tblW w:type="auto" w:w="0"/>
+        <w:jc w:val="center"/>
+        <w:tblLayout w:type="fixed"/>
+        <w:tblLook w:firstColumn="1" w:firstRow="1" w:lastColumn="0" w:lastRow="0" w:noHBand="0" w:noVBand="1" w:val="04A0"/>
+      </w:tblPr>
+      <w:tblGrid>
+        <w:gridCol w:w="9360"/>
+      </w:tblGrid>
+      <w:tr>
+        <w:tc>
+          <w:tcPr>
+            <w:tcW w:type="dxa" w:w="9360"/>
+            <w:shd w:val="clear" w:color="auto" w:fill="EBF5FB"/>
+            <w:tcMar>
+              <w:top w:w="120" w:type="dxa"/>
+              <w:bottom w:w="120" w:type="dxa"/>
+              <w:left w:w="180" w:type="dxa"/>
+              <w:right w:w="180" w:type="dxa"/>
+            </w:tcMar>
+          </w:tcPr>
+          <w:p>
+            <w:pPr>
+              <w:spacing w:before="40" w:after="40"/>
+            </w:pPr>
+            <w:r>
+              <w:rPr>
+                <w:rFonts w:ascii="Calibri" w:hAnsi="Calibri"/>
+                <w:b/>
+                <w:color w:val="1B365D"/>
+                <w:sz w:val="21"/>
+              </w:rPr>
+              <w:t xml:space="preserve">📌 Bộ câu lệnh SQL kiểm định quy trình ETL và phân tách dữ liệu sạch / bẩn: </w:t>
+            </w:r>
+            <w:r>
+              <w:rPr>
+                <w:rFonts w:ascii="Calibri" w:hAnsi="Calibri"/>
+                <w:color w:val="2C3E50"/>
+                <w:sz w:val="20"/>
+              </w:rPr>
+              <w:t>-- 1. Xem 10 dòng dữ liệu thô bị lỗi ban đầu trong Staging:</w:t>
+              <w:br/>
+              <w:t>SELECT raw_id, raw_full_name, raw_phone, raw_balance, source_batch</w:t>
+              <w:br/>
+              <w:t>FROM staging.stg_customers ORDER BY raw_id LIMIT 10;</w:t>
+              <w:br/>
+              <w:br/>
+              <w:t>-- 2. Xem bảng cách ly các dòng dữ liệu bẩn (Rejected Rows):</w:t>
+              <w:br/>
+              <w:t>SELECT rejected_id, error_reason, raw_record FROM staging.rejected_rows;</w:t>
+              <w:br/>
+              <w:br/>
+              <w:t>-- 3. Xem các dữ liệu đã được xử lý và làm sạch nạp vào CSDL chính (core.customer):</w:t>
+              <w:br/>
+              <w:t>SELECT customer_id, full_name, phone, email, username, balance</w:t>
+              <w:br/>
+              <w:t>FROM core.customer</w:t>
+              <w:br/>
+              <w:t>WHERE username LIKE 'user_%'</w:t>
+              <w:br/>
+              <w:t>ORDER BY customer_id</w:t>
+              <w:br/>
+              <w:t>LIMIT 16;</w:t>
+            </w:r>
+          </w:p>
+        </w:tc>
+      </w:tr>
+    </w:tbl>
+    <w:p>
+      <w:pPr>
+        <w:spacing w:after="80"/>
+      </w:pPr>
+    </w:p>
     <w:p>
       <w:r>
         <w:br w:type="page"/>
@@ -4971,7 +4887,7 @@
         <w:spacing w:line="276" w:lineRule="auto"/>
       </w:pPr>
       <w:r>
-        <w:t>Hệ thống phân định 5 vai trò (Roles) rõ rệt theo nguyên tắc đặc quyền tối thiểu (Least Privilege). Mỗi vai trò chỉ được cấp đúng các quyền SELECT, INSERT, UPDATE trên các bảng thuộc phạm vi công việc của mình:</w:t>
+        <w:t>Hệ thống phân định 3 vai trò người dùng (Roles) rõ rệt theo nguyên tắc đặc quyền tối thiểu (Least Privilege). Mỗi vai trò chỉ được cấp đúng các quyền SELECT, INSERT, UPDATE trên các bảng thuộc phạm vi công việc của mình:</w:t>
       </w:r>
     </w:p>
     <w:tbl>
@@ -5264,143 +5180,7 @@
                 <w:color w:val="2C3E50"/>
                 <w:sz w:val="18"/>
               </w:rPr>
-              <w:t>Thu ngân: mở phiên, lập hóa đơn, nạp tiền, thu tiền. CHỈ ĐƯỢC THẤY HÓA ĐƠN DO MÌNH LẬP (qua RLS).</w:t>
-            </w:r>
-          </w:p>
-        </w:tc>
-      </w:tr>
-      <w:tr>
-        <w:tc>
-          <w:tcPr>
-            <w:tcW w:type="dxa" w:w="3120"/>
-            <w:vAlign w:val="center"/>
-            <w:tcMar>
-              <w:top w:w="80" w:type="dxa"/>
-              <w:bottom w:w="80" w:type="dxa"/>
-              <w:left w:w="120" w:type="dxa"/>
-              <w:right w:w="120" w:type="dxa"/>
-            </w:tcMar>
-            <w:shd w:val="clear" w:color="auto" w:fill="F2F4F4"/>
-          </w:tcPr>
-          <w:p>
-            <w:r>
-              <w:rPr>
-                <w:color w:val="2C3E50"/>
-                <w:sz w:val="18"/>
-              </w:rPr>
-              <w:t>role_staff</w:t>
-            </w:r>
-          </w:p>
-        </w:tc>
-        <w:tc>
-          <w:tcPr>
-            <w:tcW w:type="dxa" w:w="3120"/>
-            <w:vAlign w:val="center"/>
-            <w:tcMar>
-              <w:top w:w="80" w:type="dxa"/>
-              <w:bottom w:w="80" w:type="dxa"/>
-              <w:left w:w="120" w:type="dxa"/>
-              <w:right w:w="120" w:type="dxa"/>
-            </w:tcMar>
-            <w:shd w:val="clear" w:color="auto" w:fill="F2F4F4"/>
-          </w:tcPr>
-          <w:p>
-            <w:r>
-              <w:rPr>
-                <w:color w:val="2C3E50"/>
-                <w:sz w:val="18"/>
-              </w:rPr>
-              <w:t>nv_tuan</w:t>
-            </w:r>
-          </w:p>
-        </w:tc>
-        <w:tc>
-          <w:tcPr>
-            <w:tcW w:type="dxa" w:w="3120"/>
-            <w:vAlign w:val="center"/>
-            <w:tcMar>
-              <w:top w:w="80" w:type="dxa"/>
-              <w:bottom w:w="80" w:type="dxa"/>
-              <w:left w:w="120" w:type="dxa"/>
-              <w:right w:w="120" w:type="dxa"/>
-            </w:tcMar>
-            <w:shd w:val="clear" w:color="auto" w:fill="F2F4F4"/>
-          </w:tcPr>
-          <w:p>
-            <w:r>
-              <w:rPr>
-                <w:color w:val="2C3E50"/>
-                <w:sz w:val="18"/>
-              </w:rPr>
-              <w:t>Nhân viên phục vụ: xem danh sách máy, gọi món F&amp;B. BỊ CHẶN HOÀN TOÀN KHỎI SCHEMA BILLING.</w:t>
-            </w:r>
-          </w:p>
-        </w:tc>
-      </w:tr>
-      <w:tr>
-        <w:tc>
-          <w:tcPr>
-            <w:tcW w:type="dxa" w:w="3120"/>
-            <w:vAlign w:val="center"/>
-            <w:tcMar>
-              <w:top w:w="80" w:type="dxa"/>
-              <w:bottom w:w="80" w:type="dxa"/>
-              <w:left w:w="120" w:type="dxa"/>
-              <w:right w:w="120" w:type="dxa"/>
-            </w:tcMar>
-            <w:shd w:val="clear" w:color="auto" w:fill="FFFFFF"/>
-          </w:tcPr>
-          <w:p>
-            <w:r>
-              <w:rPr>
-                <w:color w:val="2C3E50"/>
-                <w:sz w:val="18"/>
-              </w:rPr>
-              <w:t>role_technician</w:t>
-            </w:r>
-          </w:p>
-        </w:tc>
-        <w:tc>
-          <w:tcPr>
-            <w:tcW w:type="dxa" w:w="3120"/>
-            <w:vAlign w:val="center"/>
-            <w:tcMar>
-              <w:top w:w="80" w:type="dxa"/>
-              <w:bottom w:w="80" w:type="dxa"/>
-              <w:left w:w="120" w:type="dxa"/>
-              <w:right w:w="120" w:type="dxa"/>
-            </w:tcMar>
-            <w:shd w:val="clear" w:color="auto" w:fill="FFFFFF"/>
-          </w:tcPr>
-          <w:p>
-            <w:r>
-              <w:rPr>
-                <w:color w:val="2C3E50"/>
-                <w:sz w:val="18"/>
-              </w:rPr>
-              <w:t>nv_hung</w:t>
-            </w:r>
-          </w:p>
-        </w:tc>
-        <w:tc>
-          <w:tcPr>
-            <w:tcW w:type="dxa" w:w="3120"/>
-            <w:vAlign w:val="center"/>
-            <w:tcMar>
-              <w:top w:w="80" w:type="dxa"/>
-              <w:bottom w:w="80" w:type="dxa"/>
-              <w:left w:w="120" w:type="dxa"/>
-              <w:right w:w="120" w:type="dxa"/>
-            </w:tcMar>
-            <w:shd w:val="clear" w:color="auto" w:fill="FFFFFF"/>
-          </w:tcPr>
-          <w:p>
-            <w:r>
-              <w:rPr>
-                <w:color w:val="2C3E50"/>
-                <w:sz w:val="18"/>
-              </w:rPr>
-              <w:t>Kỹ thuật viên: xem cấu hình máy trạm, cập nhật phiếu bảo trì. CHỈ THẤY PHIẾU GIAO CHO MÌNH (qua RLS).</w:t>
+              <w:t>Nhân viên: mở phiên, lập hóa đơn, nạp tiền, thu tiền và xử lý đơn F&amp;B; invoice/payment theo RLS.</w:t>
             </w:r>
           </w:p>
         </w:tc>
@@ -5429,9 +5209,7 @@
         <w:br/>
         <w:t xml:space="preserve">   2. billing.payment: Thu ngân chỉ tra cứu được các giao dịch nạp tiền/thu tiền do chính mình tiếp nhận.</w:t>
         <w:br/>
-        <w:t xml:space="preserve">   3. hr.employee: Nhân viên cấp dưới chỉ thấy dòng thông tin cá nhân của chính mình.</w:t>
-        <w:br/>
-        <w:t xml:space="preserve">   4. hr.maintenance: Kỹ thuật viên nv_hung (ID 6) chỉ thấy đúng phiếu bảo trì được giao cho mình.</w:t>
+        <w:t xml:space="preserve">   3. hr.employee: Nhân viên chỉ thấy các cột công khai; salary/password_hash bị chặn.</w:t>
       </w:r>
     </w:p>
     <w:tbl>
@@ -6563,7 +6341,7 @@
                 <w:color w:val="2C3E50"/>
                 <w:sz w:val="18"/>
               </w:rPr>
-              <w:t>17/17 Test cases PASS, chống đặt trùng máy EXCLUDE gist, bảo vệ công thức hóa đơn.</w:t>
+              <w:t>16/16 Test cases PASS, bảo vệ công thức hóa đơn và dữ liệu phiên.</w:t>
             </w:r>
           </w:p>
         </w:tc>
@@ -6699,7 +6477,7 @@
                 <w:color w:val="2C3E50"/>
                 <w:sz w:val="18"/>
               </w:rPr>
-              <w:t>RBAC 5 vai trò, Column-Level Security (salary, password), RLS trên 4 bảng.</w:t>
+              <w:t>RBAC 3 vai trò người dùng, role station nội bộ, Column-Level Security và RLS.</w:t>
             </w:r>
           </w:p>
         </w:tc>

</xml_diff>